<commit_message>
Various improvements and fixes
</commit_message>
<xml_diff>
--- a/doc/Service de migration de données PL.docx
+++ b/doc/Service de migration de données PL.docx
@@ -12,8 +12,8 @@
           <w:noProof/>
         </w:rPr>
         <w:drawing>
-          <wp:inline distT="0" distB="0" distL="0" distR="0" wp14:anchorId="13AF6498" wp14:editId="626062F1">
-            <wp:extent cx="5759685" cy="1663908"/>
+          <wp:inline distT="0" distB="0" distL="0" distR="0" wp14:anchorId="13AF6498" wp14:editId="4A89E64F">
+            <wp:extent cx="4497049" cy="1663665"/>
             <wp:effectExtent l="0" t="0" r="0" b="0"/>
             <wp:docPr id="507576727" name="Graphic 1"/>
             <wp:cNvGraphicFramePr>
@@ -26,7 +26,7 @@
                     <pic:cNvPr id="1953700679" name="Graphic 1953700679"/>
                     <pic:cNvPicPr/>
                   </pic:nvPicPr>
-                  <pic:blipFill>
+                  <pic:blipFill rotWithShape="1">
                     <a:blip r:embed="rId7">
                       <a:extLst>
                         <a:ext uri="{96DAC541-7B7A-43D3-8B79-37D633B846F1}">
@@ -34,18 +34,27 @@
                         </a:ext>
                       </a:extLst>
                     </a:blip>
+                    <a:srcRect l="1953" r="19958"/>
                     <a:stretch>
                       <a:fillRect/>
                     </a:stretch>
                   </pic:blipFill>
-                  <pic:spPr>
+                  <pic:spPr bwMode="auto">
                     <a:xfrm>
                       <a:off x="0" y="0"/>
-                      <a:ext cx="5916779" cy="1709291"/>
+                      <a:ext cx="4620380" cy="1709291"/>
                     </a:xfrm>
                     <a:prstGeom prst="rect">
                       <a:avLst/>
                     </a:prstGeom>
+                    <a:ln>
+                      <a:noFill/>
+                    </a:ln>
+                    <a:extLst>
+                      <a:ext uri="{53640926-AAD7-44D8-BBD7-CCE9431645EC}">
+                        <a14:shadowObscured xmlns:a14="http://schemas.microsoft.com/office/drawing/2010/main"/>
+                      </a:ext>
+                    </a:extLst>
                   </pic:spPr>
                 </pic:pic>
               </a:graphicData>
@@ -671,35 +680,7 @@
           <w:sz w:val="22"/>
           <w:szCs w:val="22"/>
         </w:rPr>
-        <w:t xml:space="preserve">. </w:t>
-      </w:r>
-      <w:r>
-        <w:rPr>
-          <w:sz w:val="22"/>
-          <w:szCs w:val="22"/>
-        </w:rPr>
-        <w:t>Le format XML est un format standard utilisé mondialement</w:t>
-      </w:r>
-      <w:r>
-        <w:rPr>
-          <w:sz w:val="22"/>
-          <w:szCs w:val="22"/>
-        </w:rPr>
-        <w:t>, qui</w:t>
-      </w:r>
-      <w:r>
-        <w:rPr>
-          <w:sz w:val="22"/>
-          <w:szCs w:val="22"/>
-        </w:rPr>
-        <w:t xml:space="preserve"> permet de représenter des données complexes de façon structurées</w:t>
-      </w:r>
-      <w:r>
-        <w:rPr>
-          <w:sz w:val="22"/>
-          <w:szCs w:val="22"/>
-        </w:rPr>
-        <w:t xml:space="preserve"> et compatibles.</w:t>
+        <w:t>. Le format XML est un format standard utilisé mondialement, qui permet de représenter des données complexes de façon structurées et compatibles.</w:t>
       </w:r>
     </w:p>
     <w:p>
@@ -1323,25 +1304,7 @@
                 <w:sz w:val="20"/>
                 <w:szCs w:val="20"/>
               </w:rPr>
-              <w:t xml:space="preserve">» </w:t>
-            </w:r>
-            <w:r>
-              <w:rPr>
-                <w:rFonts w:asciiTheme="majorHAnsi" w:hAnsiTheme="majorHAnsi" w:cs="Courier New"/>
-                <w:color w:val="F1A983" w:themeColor="accent2" w:themeTint="99"/>
-                <w:sz w:val="20"/>
-                <w:szCs w:val="20"/>
-              </w:rPr>
-              <w:t>de l’</w:t>
-            </w:r>
-            <w:r>
-              <w:rPr>
-                <w:rFonts w:asciiTheme="majorHAnsi" w:hAnsiTheme="majorHAnsi" w:cs="Courier New"/>
-                <w:color w:val="F1A983" w:themeColor="accent2" w:themeTint="99"/>
-                <w:sz w:val="20"/>
-                <w:szCs w:val="20"/>
-              </w:rPr>
-              <w:t>Adresse</w:t>
+              <w:t>» de l’Adresse</w:t>
             </w:r>
           </w:p>
         </w:tc>
@@ -1731,18 +1694,7 @@
                 <w:sz w:val="20"/>
                 <w:szCs w:val="20"/>
               </w:rPr>
-              <w:t>codePost</w:t>
-            </w:r>
-            <w:r>
-              <w:rPr>
-                <w:rFonts w:ascii="Courier New" w:hAnsi="Courier New" w:cs="Courier New"/>
-                <w:b/>
-                <w:bCs/>
-                <w:color w:val="FFFFFF" w:themeColor="background1"/>
-                <w:sz w:val="20"/>
-                <w:szCs w:val="20"/>
-              </w:rPr>
-              <w:t>al</w:t>
+              <w:t>codePostal</w:t>
             </w:r>
             <w:proofErr w:type="spellEnd"/>
             <w:r>
@@ -2632,29 +2584,7 @@
                 <w:sz w:val="20"/>
                 <w:szCs w:val="20"/>
               </w:rPr>
-              <w:t>&gt;</w:t>
-            </w:r>
-            <w:r>
-              <w:rPr>
-                <w:rFonts w:ascii="Courier New" w:hAnsi="Courier New" w:cs="Courier New"/>
-                <w:b/>
-                <w:bCs/>
-                <w:color w:val="FFFFFF" w:themeColor="background1"/>
-                <w:sz w:val="20"/>
-                <w:szCs w:val="20"/>
-              </w:rPr>
-              <w:t>APPARTEMENT</w:t>
-            </w:r>
-            <w:r>
-              <w:rPr>
-                <w:rFonts w:ascii="Courier New" w:hAnsi="Courier New" w:cs="Courier New"/>
-                <w:b/>
-                <w:bCs/>
-                <w:color w:val="FFFFFF" w:themeColor="background1"/>
-                <w:sz w:val="20"/>
-                <w:szCs w:val="20"/>
-              </w:rPr>
-              <w:t>&lt;/</w:t>
+              <w:t>&gt;APPARTEMENT&lt;/</w:t>
             </w:r>
             <w:proofErr w:type="spellStart"/>
             <w:r>
@@ -2886,29 +2816,7 @@
                 <w:sz w:val="20"/>
                 <w:szCs w:val="20"/>
               </w:rPr>
-              <w:t xml:space="preserve">      &lt;matricule&gt;</w:t>
-            </w:r>
-            <w:r>
-              <w:rPr>
-                <w:rFonts w:ascii="Courier New" w:hAnsi="Courier New" w:cs="Courier New"/>
-                <w:b/>
-                <w:bCs/>
-                <w:color w:val="FFFFFF" w:themeColor="background1"/>
-                <w:sz w:val="20"/>
-                <w:szCs w:val="20"/>
-              </w:rPr>
-              <w:t>5511223344556</w:t>
-            </w:r>
-            <w:r>
-              <w:rPr>
-                <w:rFonts w:ascii="Courier New" w:hAnsi="Courier New" w:cs="Courier New"/>
-                <w:b/>
-                <w:bCs/>
-                <w:color w:val="FFFFFF" w:themeColor="background1"/>
-                <w:sz w:val="20"/>
-                <w:szCs w:val="20"/>
-              </w:rPr>
-              <w:t>&lt;/matricule&gt;</w:t>
+              <w:t xml:space="preserve">      &lt;matricule&gt;5511223344556&lt;/matricule&gt;</w:t>
             </w:r>
           </w:p>
         </w:tc>
@@ -3010,29 +2918,7 @@
                 <w:sz w:val="20"/>
                 <w:szCs w:val="20"/>
               </w:rPr>
-              <w:t xml:space="preserve">      &lt;subdivision&gt;</w:t>
-            </w:r>
-            <w:r>
-              <w:rPr>
-                <w:rFonts w:ascii="Courier New" w:hAnsi="Courier New" w:cs="Courier New"/>
-                <w:b/>
-                <w:bCs/>
-                <w:color w:val="FFFFFF" w:themeColor="background1"/>
-                <w:sz w:val="20"/>
-                <w:szCs w:val="20"/>
-              </w:rPr>
-              <w:t>App.1</w:t>
-            </w:r>
-            <w:r>
-              <w:rPr>
-                <w:rFonts w:ascii="Courier New" w:hAnsi="Courier New" w:cs="Courier New"/>
-                <w:b/>
-                <w:bCs/>
-                <w:color w:val="FFFFFF" w:themeColor="background1"/>
-                <w:sz w:val="20"/>
-                <w:szCs w:val="20"/>
-              </w:rPr>
-              <w:t>&lt;/subdivision&gt;</w:t>
+              <w:t xml:space="preserve">      &lt;subdivision&gt;App.1&lt;/subdivision&gt;</w:t>
             </w:r>
           </w:p>
         </w:tc>
@@ -3134,18 +3020,7 @@
                 <w:sz w:val="20"/>
                 <w:szCs w:val="20"/>
               </w:rPr>
-              <w:t xml:space="preserve">      </w:t>
-            </w:r>
-            <w:r>
-              <w:rPr>
-                <w:rFonts w:ascii="Courier New" w:hAnsi="Courier New" w:cs="Courier New"/>
-                <w:b/>
-                <w:bCs/>
-                <w:color w:val="FFFFFF" w:themeColor="background1"/>
-                <w:sz w:val="20"/>
-                <w:szCs w:val="20"/>
-              </w:rPr>
-              <w:t>...</w:t>
+              <w:t xml:space="preserve">      ...</w:t>
             </w:r>
           </w:p>
         </w:tc>
@@ -3192,14 +3067,7 @@
           <w:sz w:val="22"/>
           <w:szCs w:val="22"/>
         </w:rPr>
-        <w:t>Étant donné la taille massive de certains modules, les données exportées sont réparties dans plusieurs fichiers XML.</w:t>
-      </w:r>
-      <w:r>
-        <w:rPr>
-          <w:sz w:val="22"/>
-          <w:szCs w:val="22"/>
-        </w:rPr>
-        <w:t xml:space="preserve"> Par exemple, il y a un fichier </w:t>
+        <w:t xml:space="preserve">Étant donné la taille massive de certains modules, les données exportées sont réparties dans plusieurs fichiers XML. Par exemple, il y a un fichier </w:t>
       </w:r>
       <w:r>
         <w:rPr>
@@ -6638,14 +6506,7 @@
           <w:sz w:val="22"/>
           <w:szCs w:val="22"/>
         </w:rPr>
-        <w:t>Des centaines de plus petits types d’objets ne sont pas comptés pour établir le</w:t>
-      </w:r>
-      <w:r>
-        <w:rPr>
-          <w:sz w:val="22"/>
-          <w:szCs w:val="22"/>
-        </w:rPr>
-        <w:t xml:space="preserve"> coût de traitement. Cependant, tous les objets pertinents sont migrés. Par exemple, les dossiers adresse sont facturés par dossier adresse unique; les sous-objets comme les personnes ressources, les produits dangereux, les champs perso, et tout autre information pertinente seront exportés aussi, sans frais additionnel.</w:t>
+        <w:t>Des centaines de plus petits types d’objets ne sont pas comptés pour établir le coût de traitement. Cependant, tous les objets pertinents sont migrés. Par exemple, les dossiers adresse sont facturés par dossier adresse unique; les sous-objets comme les personnes ressources, les produits dangereux, les champs perso, et tout autre information pertinente seront exportés aussi, sans frais additionnel.</w:t>
       </w:r>
     </w:p>
     <w:p>
@@ -6959,21 +6820,7 @@
           <w:sz w:val="22"/>
           <w:szCs w:val="22"/>
         </w:rPr>
-        <w:t xml:space="preserve">sera analysée dans les 10 jours ouvrables. Vous recevrez ensuite une soumission </w:t>
-      </w:r>
-      <w:r>
-        <w:rPr>
-          <w:sz w:val="22"/>
-          <w:szCs w:val="22"/>
-        </w:rPr>
-        <w:t>établie sur mesure pour votre base de données</w:t>
-      </w:r>
-      <w:r>
-        <w:rPr>
-          <w:sz w:val="22"/>
-          <w:szCs w:val="22"/>
-        </w:rPr>
-        <w:t xml:space="preserve">, calculée selon la grille tarifaire en vigueur. </w:t>
+        <w:t xml:space="preserve">sera analysée dans les 10 jours ouvrables. Vous recevrez ensuite une soumission établie sur mesure pour votre base de données, calculée selon la grille tarifaire en vigueur. </w:t>
       </w:r>
       <w:r>
         <w:rPr>
@@ -7132,6 +6979,129 @@
       </w:r>
       <w:r>
         <w:t>.</w:t>
+      </w:r>
+    </w:p>
+    <w:p>
+      <w:pPr>
+        <w:pStyle w:val="Heading3"/>
+        <w:rPr>
+          <w:b/>
+          <w:bCs/>
+        </w:rPr>
+      </w:pPr>
+      <w:r>
+        <w:rPr>
+          <w:b/>
+          <w:bCs/>
+        </w:rPr>
+        <w:lastRenderedPageBreak/>
+        <w:t>Questions-réponses</w:t>
+      </w:r>
+    </w:p>
+    <w:p>
+      <w:pPr>
+        <w:pStyle w:val="ListParagraph"/>
+        <w:numPr>
+          <w:ilvl w:val="0"/>
+          <w:numId w:val="5"/>
+        </w:numPr>
+        <w:spacing w:after="240"/>
+        <w:contextualSpacing w:val="0"/>
+      </w:pPr>
+      <w:r>
+        <w:rPr>
+          <w:b/>
+          <w:bCs/>
+        </w:rPr>
+        <w:t>Est-ce que le l’export sera fidèle au rôle d’évaluation?</w:t>
+      </w:r>
+      <w:r>
+        <w:br/>
+        <w:t xml:space="preserve">Les dossiers adresse sont exportés tels quels, à l’état actuel dans votre PL. Il peut être souhaitable d’importer le plus récent rôle à jour dans PL et résoudre tous les conflits avant d’effectuer la migration de vos données, pour avoir une copie plus à jour de toutes les informations du rôle. Ce n’est cependant pas une étape obligatoire pour la </w:t>
+      </w:r>
+      <w:proofErr w:type="spellStart"/>
+      <w:r>
+        <w:t>migration.</w:t>
+      </w:r>
+      <w:proofErr w:type="spellEnd"/>
+    </w:p>
+    <w:p>
+      <w:pPr>
+        <w:pStyle w:val="ListParagraph"/>
+        <w:numPr>
+          <w:ilvl w:val="0"/>
+          <w:numId w:val="5"/>
+        </w:numPr>
+        <w:spacing w:after="240"/>
+        <w:contextualSpacing w:val="0"/>
+      </w:pPr>
+      <w:r>
+        <w:rPr>
+          <w:b/>
+          <w:bCs/>
+        </w:rPr>
+        <w:t>Est-il possible d’extraire seulement une partie des données?</w:t>
+      </w:r>
+      <w:r>
+        <w:rPr>
+          <w:b/>
+          <w:bCs/>
+        </w:rPr>
+        <w:br/>
+      </w:r>
+      <w:r>
+        <w:t>Non, le système de migration traite la base de données dans son intégralité, pour éviter les objets orphelins et interdépendances brisées. Le coût de traitement est donc toujours pour la base de données complète, sans possibilité de choisir « à la carte ».</w:t>
+      </w:r>
+    </w:p>
+    <w:p>
+      <w:pPr>
+        <w:pStyle w:val="ListParagraph"/>
+        <w:numPr>
+          <w:ilvl w:val="0"/>
+          <w:numId w:val="5"/>
+        </w:numPr>
+        <w:spacing w:after="240"/>
+        <w:contextualSpacing w:val="0"/>
+      </w:pPr>
+      <w:r>
+        <w:rPr>
+          <w:b/>
+          <w:bCs/>
+        </w:rPr>
+        <w:t xml:space="preserve">Est-ce que TOUTES les données sont migrées? </w:t>
+      </w:r>
+      <w:r>
+        <w:rPr>
+          <w:b/>
+          <w:bCs/>
+          <w:i/>
+          <w:iCs/>
+        </w:rPr>
+        <w:t xml:space="preserve">(temps payé de chaque employé pour chaque activité, </w:t>
+      </w:r>
+      <w:proofErr w:type="gramStart"/>
+      <w:r>
+        <w:rPr>
+          <w:b/>
+          <w:bCs/>
+          <w:i/>
+          <w:iCs/>
+        </w:rPr>
+        <w:t>champs perso</w:t>
+      </w:r>
+      <w:proofErr w:type="gramEnd"/>
+      <w:r>
+        <w:rPr>
+          <w:b/>
+          <w:bCs/>
+          <w:i/>
+          <w:iCs/>
+        </w:rPr>
+        <w:t xml:space="preserve"> des dossiers adresse, etc.)</w:t>
+      </w:r>
+      <w:r>
+        <w:br/>
+        <w:t>Oui, toutes les données sont migrées.</w:t>
       </w:r>
     </w:p>
     <w:sectPr>
@@ -7176,8 +7146,8 @@
         <w:noProof/>
       </w:rPr>
       <w:drawing>
-        <wp:inline distT="0" distB="0" distL="0" distR="0" wp14:anchorId="5E6400F0" wp14:editId="3D84E02A">
-          <wp:extent cx="1881266" cy="543477"/>
+        <wp:inline distT="0" distB="0" distL="0" distR="0" wp14:anchorId="5E6400F0" wp14:editId="0D63D2F7">
+          <wp:extent cx="1514007" cy="542925"/>
           <wp:effectExtent l="0" t="0" r="0" b="0"/>
           <wp:docPr id="1953700679" name="Graphic 1"/>
           <wp:cNvGraphicFramePr>
@@ -7190,7 +7160,7 @@
                   <pic:cNvPr id="1953700679" name="Graphic 1953700679"/>
                   <pic:cNvPicPr/>
                 </pic:nvPicPr>
-                <pic:blipFill>
+                <pic:blipFill rotWithShape="1">
                   <a:blip r:embed="rId1">
                     <a:extLst>
                       <a:ext uri="{96DAC541-7B7A-43D3-8B79-37D633B846F1}">
@@ -7198,18 +7168,27 @@
                       </a:ext>
                     </a:extLst>
                   </a:blip>
+                  <a:srcRect r="19440"/>
                   <a:stretch>
                     <a:fillRect/>
                   </a:stretch>
                 </pic:blipFill>
-                <pic:spPr>
+                <pic:spPr bwMode="auto">
                   <a:xfrm>
                     <a:off x="0" y="0"/>
-                    <a:ext cx="1920134" cy="554705"/>
+                    <a:ext cx="1546857" cy="554705"/>
                   </a:xfrm>
                   <a:prstGeom prst="rect">
                     <a:avLst/>
                   </a:prstGeom>
+                  <a:ln>
+                    <a:noFill/>
+                  </a:ln>
+                  <a:extLst>
+                    <a:ext uri="{53640926-AAD7-44D8-BBD7-CCE9431645EC}">
+                      <a14:shadowObscured xmlns:a14="http://schemas.microsoft.com/office/drawing/2010/main"/>
+                    </a:ext>
+                  </a:extLst>
                 </pic:spPr>
               </pic:pic>
             </a:graphicData>
@@ -7243,6 +7222,92 @@
 <file path=word/numbering.xml><?xml version="1.0" encoding="utf-8"?>
 <w:numbering xmlns:wpc="http://schemas.microsoft.com/office/word/2010/wordprocessingCanvas" xmlns:cx="http://schemas.microsoft.com/office/drawing/2014/chartex" xmlns:cx1="http://schemas.microsoft.com/office/drawing/2015/9/8/chartex" xmlns:cx2="http://schemas.microsoft.com/office/drawing/2015/10/21/chartex" xmlns:cx3="http://schemas.microsoft.com/office/drawing/2016/5/9/chartex" xmlns:cx4="http://schemas.microsoft.com/office/drawing/2016/5/10/chartex" xmlns:cx5="http://schemas.microsoft.com/office/drawing/2016/5/11/chartex" xmlns:cx6="http://schemas.microsoft.com/office/drawing/2016/5/12/chartex" xmlns:cx7="http://schemas.microsoft.com/office/drawing/2016/5/13/chartex" xmlns:cx8="http://schemas.microsoft.com/office/drawing/2016/5/14/chartex" xmlns:mc="http://schemas.openxmlformats.org/markup-compatibility/2006" xmlns:aink="http://schemas.microsoft.com/office/drawing/2016/ink" xmlns:am3d="http://schemas.microsoft.com/office/drawing/2017/model3d" xmlns:o="urn:schemas-microsoft-com:office:office" xmlns:oel="http://schemas.microsoft.com/office/2019/extlst" xmlns:r="http://schemas.openxmlformats.org/officeDocument/2006/relationships" xmlns:m="http://schemas.openxmlformats.org/officeDocument/2006/math" xmlns:v="urn:schemas-microsoft-com:vml" xmlns:wp14="http://schemas.microsoft.com/office/word/2010/wordprocessingDrawing" xmlns:wp="http://schemas.openxmlformats.org/drawingml/2006/wordprocessingDrawing" xmlns:w10="urn:schemas-microsoft-com:office:word" xmlns:w="http://schemas.openxmlformats.org/wordprocessingml/2006/main" xmlns:w14="http://schemas.microsoft.com/office/word/2010/wordml" xmlns:w15="http://schemas.microsoft.com/office/word/2012/wordml" xmlns:w16cex="http://schemas.microsoft.com/office/word/2018/wordml/cex" xmlns:w16cid="http://schemas.microsoft.com/office/word/2016/wordml/cid" xmlns:w16="http://schemas.microsoft.com/office/word/2018/wordml" xmlns:w16du="http://schemas.microsoft.com/office/word/2023/wordml/word16du" xmlns:w16sdtdh="http://schemas.microsoft.com/office/word/2020/wordml/sdtdatahash" xmlns:w16sdtfl="http://schemas.microsoft.com/office/word/2024/wordml/sdtformatlock" xmlns:w16se="http://schemas.microsoft.com/office/word/2015/wordml/symex" xmlns:wpg="http://schemas.microsoft.com/office/word/2010/wordprocessingGroup" xmlns:wpi="http://schemas.microsoft.com/office/word/2010/wordprocessingInk" xmlns:wne="http://schemas.microsoft.com/office/word/2006/wordml" xmlns:wps="http://schemas.microsoft.com/office/word/2010/wordprocessingShape" mc:Ignorable="w14 w15 w16se w16cid w16 w16cex w16sdtdh w16sdtfl w16du wp14">
   <w:abstractNum w:abstractNumId="0" w15:restartNumberingAfterBreak="0">
+    <w:nsid w:val="08F71293"/>
+    <w:multiLevelType w:val="hybridMultilevel"/>
+    <w:tmpl w:val="8F680A36"/>
+    <w:lvl w:ilvl="0" w:tplc="0409000F">
+      <w:start w:val="1"/>
+      <w:numFmt w:val="decimal"/>
+      <w:lvlText w:val="%1."/>
+      <w:lvlJc w:val="left"/>
+      <w:pPr>
+        <w:ind w:left="720" w:hanging="360"/>
+      </w:pPr>
+    </w:lvl>
+    <w:lvl w:ilvl="1" w:tplc="04090019" w:tentative="1">
+      <w:start w:val="1"/>
+      <w:numFmt w:val="lowerLetter"/>
+      <w:lvlText w:val="%2."/>
+      <w:lvlJc w:val="left"/>
+      <w:pPr>
+        <w:ind w:left="1440" w:hanging="360"/>
+      </w:pPr>
+    </w:lvl>
+    <w:lvl w:ilvl="2" w:tplc="0409001B" w:tentative="1">
+      <w:start w:val="1"/>
+      <w:numFmt w:val="lowerRoman"/>
+      <w:lvlText w:val="%3."/>
+      <w:lvlJc w:val="right"/>
+      <w:pPr>
+        <w:ind w:left="2160" w:hanging="180"/>
+      </w:pPr>
+    </w:lvl>
+    <w:lvl w:ilvl="3" w:tplc="0409000F" w:tentative="1">
+      <w:start w:val="1"/>
+      <w:numFmt w:val="decimal"/>
+      <w:lvlText w:val="%4."/>
+      <w:lvlJc w:val="left"/>
+      <w:pPr>
+        <w:ind w:left="2880" w:hanging="360"/>
+      </w:pPr>
+    </w:lvl>
+    <w:lvl w:ilvl="4" w:tplc="04090019" w:tentative="1">
+      <w:start w:val="1"/>
+      <w:numFmt w:val="lowerLetter"/>
+      <w:lvlText w:val="%5."/>
+      <w:lvlJc w:val="left"/>
+      <w:pPr>
+        <w:ind w:left="3600" w:hanging="360"/>
+      </w:pPr>
+    </w:lvl>
+    <w:lvl w:ilvl="5" w:tplc="0409001B" w:tentative="1">
+      <w:start w:val="1"/>
+      <w:numFmt w:val="lowerRoman"/>
+      <w:lvlText w:val="%6."/>
+      <w:lvlJc w:val="right"/>
+      <w:pPr>
+        <w:ind w:left="4320" w:hanging="180"/>
+      </w:pPr>
+    </w:lvl>
+    <w:lvl w:ilvl="6" w:tplc="0409000F" w:tentative="1">
+      <w:start w:val="1"/>
+      <w:numFmt w:val="decimal"/>
+      <w:lvlText w:val="%7."/>
+      <w:lvlJc w:val="left"/>
+      <w:pPr>
+        <w:ind w:left="5040" w:hanging="360"/>
+      </w:pPr>
+    </w:lvl>
+    <w:lvl w:ilvl="7" w:tplc="04090019" w:tentative="1">
+      <w:start w:val="1"/>
+      <w:numFmt w:val="lowerLetter"/>
+      <w:lvlText w:val="%8."/>
+      <w:lvlJc w:val="left"/>
+      <w:pPr>
+        <w:ind w:left="5760" w:hanging="360"/>
+      </w:pPr>
+    </w:lvl>
+    <w:lvl w:ilvl="8" w:tplc="0409001B" w:tentative="1">
+      <w:start w:val="1"/>
+      <w:numFmt w:val="lowerRoman"/>
+      <w:lvlText w:val="%9."/>
+      <w:lvlJc w:val="right"/>
+      <w:pPr>
+        <w:ind w:left="6480" w:hanging="180"/>
+      </w:pPr>
+    </w:lvl>
+  </w:abstractNum>
+  <w:abstractNum w:abstractNumId="1" w15:restartNumberingAfterBreak="0">
     <w:nsid w:val="1C411C2A"/>
     <w:multiLevelType w:val="hybridMultilevel"/>
     <w:tmpl w:val="7DCA0C4E"/>
@@ -7328,7 +7393,7 @@
       </w:pPr>
     </w:lvl>
   </w:abstractNum>
-  <w:abstractNum w:abstractNumId="1" w15:restartNumberingAfterBreak="0">
+  <w:abstractNum w:abstractNumId="2" w15:restartNumberingAfterBreak="0">
     <w:nsid w:val="37E6418E"/>
     <w:multiLevelType w:val="hybridMultilevel"/>
     <w:tmpl w:val="3BCEB312"/>
@@ -7414,7 +7479,7 @@
       </w:pPr>
     </w:lvl>
   </w:abstractNum>
-  <w:abstractNum w:abstractNumId="2" w15:restartNumberingAfterBreak="0">
+  <w:abstractNum w:abstractNumId="3" w15:restartNumberingAfterBreak="0">
     <w:nsid w:val="40106554"/>
     <w:multiLevelType w:val="hybridMultilevel"/>
     <w:tmpl w:val="3BD83F1C"/>
@@ -7500,7 +7565,7 @@
       </w:pPr>
     </w:lvl>
   </w:abstractNum>
-  <w:abstractNum w:abstractNumId="3" w15:restartNumberingAfterBreak="0">
+  <w:abstractNum w:abstractNumId="4" w15:restartNumberingAfterBreak="0">
     <w:nsid w:val="448C6005"/>
     <w:multiLevelType w:val="hybridMultilevel"/>
     <w:tmpl w:val="B43C1A30"/>
@@ -7587,16 +7652,19 @@
     </w:lvl>
   </w:abstractNum>
   <w:num w:numId="1" w16cid:durableId="1838303495">
+    <w:abstractNumId w:val="4"/>
+  </w:num>
+  <w:num w:numId="2" w16cid:durableId="118378228">
+    <w:abstractNumId w:val="1"/>
+  </w:num>
+  <w:num w:numId="3" w16cid:durableId="1903713801">
+    <w:abstractNumId w:val="2"/>
+  </w:num>
+  <w:num w:numId="4" w16cid:durableId="1037971093">
     <w:abstractNumId w:val="3"/>
   </w:num>
-  <w:num w:numId="2" w16cid:durableId="118378228">
+  <w:num w:numId="5" w16cid:durableId="1205289184">
     <w:abstractNumId w:val="0"/>
-  </w:num>
-  <w:num w:numId="3" w16cid:durableId="1903713801">
-    <w:abstractNumId w:val="1"/>
-  </w:num>
-  <w:num w:numId="4" w16cid:durableId="1037971093">
-    <w:abstractNumId w:val="2"/>
   </w:num>
 </w:numbering>
 </file>
@@ -8199,6 +8267,7 @@
   <w:style w:type="character" w:default="1" w:styleId="DefaultParagraphFont">
     <w:name w:val="Default Paragraph Font"/>
     <w:uiPriority w:val="1"/>
+    <w:semiHidden/>
     <w:unhideWhenUsed/>
   </w:style>
   <w:style w:type="table" w:default="1" w:styleId="TableNormal">

</xml_diff>

<commit_message>
Significant improvements in collection exploration
</commit_message>
<xml_diff>
--- a/doc/Service de migration de données PL.docx
+++ b/doc/Service de migration de données PL.docx
@@ -772,17 +772,17 @@
                 <w:rFonts w:ascii="Courier New" w:hAnsi="Courier New" w:cs="Courier New"/>
                 <w:b/>
                 <w:bCs/>
-                <w:color w:val="FFFFFF" w:themeColor="background1"/>
-                <w:sz w:val="20"/>
-                <w:szCs w:val="20"/>
-              </w:rPr>
-            </w:pPr>
-            <w:r>
-              <w:rPr>
-                <w:rFonts w:ascii="Courier New" w:hAnsi="Courier New" w:cs="Courier New"/>
-                <w:b/>
-                <w:bCs/>
-                <w:color w:val="FFFFFF" w:themeColor="background1"/>
+                <w:color w:val="47D459" w:themeColor="accent3" w:themeTint="99"/>
+                <w:sz w:val="20"/>
+                <w:szCs w:val="20"/>
+              </w:rPr>
+            </w:pPr>
+            <w:r>
+              <w:rPr>
+                <w:rFonts w:ascii="Courier New" w:hAnsi="Courier New" w:cs="Courier New"/>
+                <w:b/>
+                <w:bCs/>
+                <w:color w:val="47D459" w:themeColor="accent3" w:themeTint="99"/>
                 <w:sz w:val="20"/>
                 <w:szCs w:val="20"/>
               </w:rPr>
@@ -794,7 +794,7 @@
                 <w:rFonts w:ascii="Courier New" w:hAnsi="Courier New" w:cs="Courier New"/>
                 <w:b/>
                 <w:bCs/>
-                <w:color w:val="FFFFFF" w:themeColor="background1"/>
+                <w:color w:val="47D459" w:themeColor="accent3" w:themeTint="99"/>
                 <w:sz w:val="20"/>
                 <w:szCs w:val="20"/>
               </w:rPr>
@@ -806,7 +806,7 @@
                 <w:rFonts w:ascii="Courier New" w:hAnsi="Courier New" w:cs="Courier New"/>
                 <w:b/>
                 <w:bCs/>
-                <w:color w:val="FFFFFF" w:themeColor="background1"/>
+                <w:color w:val="47D459" w:themeColor="accent3" w:themeTint="99"/>
                 <w:sz w:val="20"/>
                 <w:szCs w:val="20"/>
               </w:rPr>
@@ -901,7 +901,53 @@
                 <w:sz w:val="20"/>
                 <w:szCs w:val="20"/>
               </w:rPr>
-              <w:t xml:space="preserve">      &lt;id&gt;1187978&lt;/id&gt;</w:t>
+              <w:t xml:space="preserve">      &lt;</w:t>
+            </w:r>
+            <w:proofErr w:type="gramStart"/>
+            <w:r>
+              <w:rPr>
+                <w:rFonts w:ascii="Courier New" w:hAnsi="Courier New" w:cs="Courier New"/>
+                <w:b/>
+                <w:bCs/>
+                <w:color w:val="FFFFFF" w:themeColor="background1"/>
+                <w:sz w:val="20"/>
+                <w:szCs w:val="20"/>
+              </w:rPr>
+              <w:t>id</w:t>
+            </w:r>
+            <w:proofErr w:type="gramEnd"/>
+            <w:r>
+              <w:rPr>
+                <w:rFonts w:ascii="Courier New" w:hAnsi="Courier New" w:cs="Courier New"/>
+                <w:b/>
+                <w:bCs/>
+                <w:color w:val="FFFFFF" w:themeColor="background1"/>
+                <w:sz w:val="20"/>
+                <w:szCs w:val="20"/>
+              </w:rPr>
+              <w:t>&gt;</w:t>
+            </w:r>
+            <w:r>
+              <w:rPr>
+                <w:rFonts w:ascii="Courier New" w:hAnsi="Courier New" w:cs="Courier New"/>
+                <w:b/>
+                <w:bCs/>
+                <w:color w:val="FFFF00"/>
+                <w:sz w:val="20"/>
+                <w:szCs w:val="20"/>
+              </w:rPr>
+              <w:t>1187978</w:t>
+            </w:r>
+            <w:r>
+              <w:rPr>
+                <w:rFonts w:ascii="Courier New" w:hAnsi="Courier New" w:cs="Courier New"/>
+                <w:b/>
+                <w:bCs/>
+                <w:color w:val="FFFFFF" w:themeColor="background1"/>
+                <w:sz w:val="20"/>
+                <w:szCs w:val="20"/>
+              </w:rPr>
+              <w:t>&lt;/id&gt;</w:t>
             </w:r>
           </w:p>
         </w:tc>
@@ -1069,17 +1115,17 @@
                 <w:rFonts w:ascii="Courier New" w:hAnsi="Courier New" w:cs="Courier New"/>
                 <w:b/>
                 <w:bCs/>
-                <w:color w:val="FFFFFF" w:themeColor="background1"/>
-                <w:sz w:val="20"/>
-                <w:szCs w:val="20"/>
-              </w:rPr>
-            </w:pPr>
-            <w:r>
-              <w:rPr>
-                <w:rFonts w:ascii="Courier New" w:hAnsi="Courier New" w:cs="Courier New"/>
-                <w:b/>
-                <w:bCs/>
-                <w:color w:val="FFFFFF" w:themeColor="background1"/>
+                <w:color w:val="47D459" w:themeColor="accent3" w:themeTint="99"/>
+                <w:sz w:val="20"/>
+                <w:szCs w:val="20"/>
+              </w:rPr>
+            </w:pPr>
+            <w:r>
+              <w:rPr>
+                <w:rFonts w:ascii="Courier New" w:hAnsi="Courier New" w:cs="Courier New"/>
+                <w:b/>
+                <w:bCs/>
+                <w:color w:val="47D459" w:themeColor="accent3" w:themeTint="99"/>
                 <w:sz w:val="20"/>
                 <w:szCs w:val="20"/>
               </w:rPr>
@@ -1205,7 +1251,7 @@
                 <w:rFonts w:ascii="Courier New" w:hAnsi="Courier New" w:cs="Courier New"/>
                 <w:b/>
                 <w:bCs/>
-                <w:color w:val="FFFFFF" w:themeColor="background1"/>
+                <w:color w:val="FFFF00"/>
                 <w:sz w:val="20"/>
                 <w:szCs w:val="20"/>
               </w:rPr>
@@ -1361,7 +1407,29 @@
                 <w:sz w:val="20"/>
                 <w:szCs w:val="20"/>
               </w:rPr>
-              <w:t>&gt;rue&lt;/</w:t>
+              <w:t>&gt;</w:t>
+            </w:r>
+            <w:r>
+              <w:rPr>
+                <w:rFonts w:ascii="Courier New" w:hAnsi="Courier New" w:cs="Courier New"/>
+                <w:b/>
+                <w:bCs/>
+                <w:color w:val="FFFF00"/>
+                <w:sz w:val="20"/>
+                <w:szCs w:val="20"/>
+              </w:rPr>
+              <w:t>rue</w:t>
+            </w:r>
+            <w:r>
+              <w:rPr>
+                <w:rFonts w:ascii="Courier New" w:hAnsi="Courier New" w:cs="Courier New"/>
+                <w:b/>
+                <w:bCs/>
+                <w:color w:val="FFFFFF" w:themeColor="background1"/>
+                <w:sz w:val="20"/>
+                <w:szCs w:val="20"/>
+              </w:rPr>
+              <w:t>&lt;/</w:t>
             </w:r>
             <w:proofErr w:type="spellStart"/>
             <w:r>
@@ -1478,7 +1546,29 @@
                 <w:sz w:val="20"/>
                 <w:szCs w:val="20"/>
               </w:rPr>
-              <w:t xml:space="preserve">          &lt;rue&gt;PRINCIPALE&lt;/rue&gt;</w:t>
+              <w:t xml:space="preserve">          &lt;rue&gt;</w:t>
+            </w:r>
+            <w:r>
+              <w:rPr>
+                <w:rFonts w:ascii="Courier New" w:hAnsi="Courier New" w:cs="Courier New"/>
+                <w:b/>
+                <w:bCs/>
+                <w:color w:val="FFFF00"/>
+                <w:sz w:val="20"/>
+                <w:szCs w:val="20"/>
+              </w:rPr>
+              <w:t>PRINCIPALE</w:t>
+            </w:r>
+            <w:r>
+              <w:rPr>
+                <w:rFonts w:ascii="Courier New" w:hAnsi="Courier New" w:cs="Courier New"/>
+                <w:b/>
+                <w:bCs/>
+                <w:color w:val="FFFFFF" w:themeColor="background1"/>
+                <w:sz w:val="20"/>
+                <w:szCs w:val="20"/>
+              </w:rPr>
+              <w:t>&lt;/rue&gt;</w:t>
             </w:r>
           </w:p>
         </w:tc>
@@ -1569,14 +1659,25 @@
                 <w:sz w:val="20"/>
                 <w:szCs w:val="20"/>
               </w:rPr>
-              <w:t xml:space="preserve">          &lt;ville&gt;Saint</w:t>
-            </w:r>
-            <w:r>
-              <w:rPr>
-                <w:rFonts w:ascii="Courier New" w:hAnsi="Courier New" w:cs="Courier New"/>
-                <w:b/>
-                <w:bCs/>
-                <w:color w:val="FFFFFF" w:themeColor="background1"/>
+              <w:t xml:space="preserve">          &lt;ville&gt;</w:t>
+            </w:r>
+            <w:r>
+              <w:rPr>
+                <w:rFonts w:ascii="Courier New" w:hAnsi="Courier New" w:cs="Courier New"/>
+                <w:b/>
+                <w:bCs/>
+                <w:color w:val="FFFF00"/>
+                <w:sz w:val="20"/>
+                <w:szCs w:val="20"/>
+              </w:rPr>
+              <w:t>Saint</w:t>
+            </w:r>
+            <w:r>
+              <w:rPr>
+                <w:rFonts w:ascii="Courier New" w:hAnsi="Courier New" w:cs="Courier New"/>
+                <w:b/>
+                <w:bCs/>
+                <w:color w:val="FFFF00"/>
                 <w:sz w:val="20"/>
                 <w:szCs w:val="20"/>
               </w:rPr>
@@ -1713,7 +1814,7 @@
                 <w:rFonts w:ascii="Courier New" w:hAnsi="Courier New" w:cs="Courier New"/>
                 <w:b/>
                 <w:bCs/>
-                <w:color w:val="FFFFFF" w:themeColor="background1"/>
+                <w:color w:val="FFFF00"/>
                 <w:sz w:val="20"/>
                 <w:szCs w:val="20"/>
               </w:rPr>
@@ -1845,7 +1946,29 @@
                 <w:sz w:val="20"/>
                 <w:szCs w:val="20"/>
               </w:rPr>
-              <w:t xml:space="preserve">          &lt;secteur&gt;03&lt;/secteur&gt;</w:t>
+              <w:t xml:space="preserve">          &lt;secteur&gt;</w:t>
+            </w:r>
+            <w:r>
+              <w:rPr>
+                <w:rFonts w:ascii="Courier New" w:hAnsi="Courier New" w:cs="Courier New"/>
+                <w:b/>
+                <w:bCs/>
+                <w:color w:val="FFFF00"/>
+                <w:sz w:val="20"/>
+                <w:szCs w:val="20"/>
+              </w:rPr>
+              <w:t>03</w:t>
+            </w:r>
+            <w:r>
+              <w:rPr>
+                <w:rFonts w:ascii="Courier New" w:hAnsi="Courier New" w:cs="Courier New"/>
+                <w:b/>
+                <w:bCs/>
+                <w:color w:val="FFFFFF" w:themeColor="background1"/>
+                <w:sz w:val="20"/>
+                <w:szCs w:val="20"/>
+              </w:rPr>
+              <w:t>&lt;/secteur&gt;</w:t>
             </w:r>
           </w:p>
         </w:tc>
@@ -1967,7 +2090,7 @@
                 <w:rFonts w:ascii="Courier New" w:hAnsi="Courier New" w:cs="Courier New"/>
                 <w:b/>
                 <w:bCs/>
-                <w:color w:val="FFFFFF" w:themeColor="background1"/>
+                <w:color w:val="FFFF00"/>
                 <w:sz w:val="20"/>
                 <w:szCs w:val="20"/>
               </w:rPr>
@@ -2130,7 +2253,7 @@
                 <w:rFonts w:ascii="Courier New" w:hAnsi="Courier New" w:cs="Courier New"/>
                 <w:b/>
                 <w:bCs/>
-                <w:color w:val="FFFFFF" w:themeColor="background1"/>
+                <w:color w:val="FFFF00"/>
                 <w:sz w:val="20"/>
                 <w:szCs w:val="20"/>
               </w:rPr>
@@ -2262,7 +2385,29 @@
                 <w:sz w:val="20"/>
                 <w:szCs w:val="20"/>
               </w:rPr>
-              <w:t xml:space="preserve">          &lt;arrondissement&gt;urbain&lt;/arrondissement&gt;</w:t>
+              <w:t xml:space="preserve">          &lt;arrondissement&gt;</w:t>
+            </w:r>
+            <w:r>
+              <w:rPr>
+                <w:rFonts w:ascii="Courier New" w:hAnsi="Courier New" w:cs="Courier New"/>
+                <w:b/>
+                <w:bCs/>
+                <w:color w:val="FFFF00"/>
+                <w:sz w:val="20"/>
+                <w:szCs w:val="20"/>
+              </w:rPr>
+              <w:t>urbain</w:t>
+            </w:r>
+            <w:r>
+              <w:rPr>
+                <w:rFonts w:ascii="Courier New" w:hAnsi="Courier New" w:cs="Courier New"/>
+                <w:b/>
+                <w:bCs/>
+                <w:color w:val="FFFFFF" w:themeColor="background1"/>
+                <w:sz w:val="20"/>
+                <w:szCs w:val="20"/>
+              </w:rPr>
+              <w:t>&lt;/arrondissement&gt;</w:t>
             </w:r>
           </w:p>
         </w:tc>
@@ -2387,7 +2532,7 @@
                 <w:rFonts w:ascii="Courier New" w:hAnsi="Courier New" w:cs="Courier New"/>
                 <w:b/>
                 <w:bCs/>
-                <w:color w:val="FFFFFF" w:themeColor="background1"/>
+                <w:color w:val="FFFF00"/>
                 <w:sz w:val="20"/>
                 <w:szCs w:val="20"/>
               </w:rPr>
@@ -2584,7 +2729,29 @@
                 <w:sz w:val="20"/>
                 <w:szCs w:val="20"/>
               </w:rPr>
-              <w:t>&gt;APPARTEMENT&lt;/</w:t>
+              <w:t>&gt;</w:t>
+            </w:r>
+            <w:r>
+              <w:rPr>
+                <w:rFonts w:ascii="Courier New" w:hAnsi="Courier New" w:cs="Courier New"/>
+                <w:b/>
+                <w:bCs/>
+                <w:color w:val="FFFF00"/>
+                <w:sz w:val="20"/>
+                <w:szCs w:val="20"/>
+              </w:rPr>
+              <w:t>APPARTEMENT</w:t>
+            </w:r>
+            <w:r>
+              <w:rPr>
+                <w:rFonts w:ascii="Courier New" w:hAnsi="Courier New" w:cs="Courier New"/>
+                <w:b/>
+                <w:bCs/>
+                <w:color w:val="FFFFFF" w:themeColor="background1"/>
+                <w:sz w:val="20"/>
+                <w:szCs w:val="20"/>
+              </w:rPr>
+              <w:t>&lt;/</w:t>
             </w:r>
             <w:proofErr w:type="spellStart"/>
             <w:r>
@@ -2696,17 +2863,17 @@
                 <w:rFonts w:ascii="Courier New" w:hAnsi="Courier New" w:cs="Courier New"/>
                 <w:b/>
                 <w:bCs/>
-                <w:color w:val="FFFFFF" w:themeColor="background1"/>
-                <w:sz w:val="20"/>
-                <w:szCs w:val="20"/>
-              </w:rPr>
-            </w:pPr>
-            <w:r>
-              <w:rPr>
-                <w:rFonts w:ascii="Courier New" w:hAnsi="Courier New" w:cs="Courier New"/>
-                <w:b/>
-                <w:bCs/>
-                <w:color w:val="FFFFFF" w:themeColor="background1"/>
+                <w:color w:val="47D459" w:themeColor="accent3" w:themeTint="99"/>
+                <w:sz w:val="20"/>
+                <w:szCs w:val="20"/>
+              </w:rPr>
+            </w:pPr>
+            <w:r>
+              <w:rPr>
+                <w:rFonts w:ascii="Courier New" w:hAnsi="Courier New" w:cs="Courier New"/>
+                <w:b/>
+                <w:bCs/>
+                <w:color w:val="47D459" w:themeColor="accent3" w:themeTint="99"/>
                 <w:sz w:val="20"/>
                 <w:szCs w:val="20"/>
               </w:rPr>
@@ -2816,7 +2983,29 @@
                 <w:sz w:val="20"/>
                 <w:szCs w:val="20"/>
               </w:rPr>
-              <w:t xml:space="preserve">      &lt;matricule&gt;5511223344556&lt;/matricule&gt;</w:t>
+              <w:t xml:space="preserve">      &lt;matricule&gt;</w:t>
+            </w:r>
+            <w:r>
+              <w:rPr>
+                <w:rFonts w:ascii="Courier New" w:hAnsi="Courier New" w:cs="Courier New"/>
+                <w:b/>
+                <w:bCs/>
+                <w:color w:val="FFFF00"/>
+                <w:sz w:val="20"/>
+                <w:szCs w:val="20"/>
+              </w:rPr>
+              <w:t>5511223344556</w:t>
+            </w:r>
+            <w:r>
+              <w:rPr>
+                <w:rFonts w:ascii="Courier New" w:hAnsi="Courier New" w:cs="Courier New"/>
+                <w:b/>
+                <w:bCs/>
+                <w:color w:val="FFFFFF" w:themeColor="background1"/>
+                <w:sz w:val="20"/>
+                <w:szCs w:val="20"/>
+              </w:rPr>
+              <w:t>&lt;/matricule&gt;</w:t>
             </w:r>
           </w:p>
         </w:tc>
@@ -2918,7 +3107,29 @@
                 <w:sz w:val="20"/>
                 <w:szCs w:val="20"/>
               </w:rPr>
-              <w:t xml:space="preserve">      &lt;subdivision&gt;App.1&lt;/subdivision&gt;</w:t>
+              <w:t xml:space="preserve">      &lt;subdivision&gt;</w:t>
+            </w:r>
+            <w:r>
+              <w:rPr>
+                <w:rFonts w:ascii="Courier New" w:hAnsi="Courier New" w:cs="Courier New"/>
+                <w:b/>
+                <w:bCs/>
+                <w:color w:val="FFFF00"/>
+                <w:sz w:val="20"/>
+                <w:szCs w:val="20"/>
+              </w:rPr>
+              <w:t>App.1</w:t>
+            </w:r>
+            <w:r>
+              <w:rPr>
+                <w:rFonts w:ascii="Courier New" w:hAnsi="Courier New" w:cs="Courier New"/>
+                <w:b/>
+                <w:bCs/>
+                <w:color w:val="FFFFFF" w:themeColor="background1"/>
+                <w:sz w:val="20"/>
+                <w:szCs w:val="20"/>
+              </w:rPr>
+              <w:t>&lt;/subdivision&gt;</w:t>
             </w:r>
           </w:p>
         </w:tc>
@@ -7017,13 +7228,8 @@
       </w:r>
       <w:r>
         <w:br/>
-        <w:t xml:space="preserve">Les dossiers adresse sont exportés tels quels, à l’état actuel dans votre PL. Il peut être souhaitable d’importer le plus récent rôle à jour dans PL et résoudre tous les conflits avant d’effectuer la migration de vos données, pour avoir une copie plus à jour de toutes les informations du rôle. Ce n’est cependant pas une étape obligatoire pour la </w:t>
-      </w:r>
-      <w:proofErr w:type="spellStart"/>
-      <w:r>
-        <w:t>migration.</w:t>
-      </w:r>
-      <w:proofErr w:type="spellEnd"/>
+        <w:t>Les dossiers adresse sont exportés tels quels, à l’état actuel dans votre PL. Il peut être souhaitable d’importer le plus récent rôle à jour dans PL et résoudre tous les conflits avant d’effectuer la migration de vos données, pour avoir une copie plus à jour de toutes les informations du rôle. Ce n’est cependant pas une étape obligatoire pour la migration.</w:t>
+      </w:r>
     </w:p>
     <w:p>
       <w:pPr>
@@ -7077,7 +7283,27 @@
           <w:i/>
           <w:iCs/>
         </w:rPr>
-        <w:t xml:space="preserve">(temps payé de chaque employé pour chaque activité, </w:t>
+        <w:t>(</w:t>
+      </w:r>
+      <w:proofErr w:type="gramStart"/>
+      <w:r>
+        <w:rPr>
+          <w:b/>
+          <w:bCs/>
+          <w:i/>
+          <w:iCs/>
+        </w:rPr>
+        <w:t>temps</w:t>
+      </w:r>
+      <w:proofErr w:type="gramEnd"/>
+      <w:r>
+        <w:rPr>
+          <w:b/>
+          <w:bCs/>
+          <w:i/>
+          <w:iCs/>
+        </w:rPr>
+        <w:t xml:space="preserve"> payé de chaque employé pour chaque activité, </w:t>
       </w:r>
       <w:proofErr w:type="gramStart"/>
       <w:r>

</xml_diff>